<commit_message>
add link to midterm review slides
</commit_message>
<xml_diff>
--- a/Midterm_Exam_Key.docx
+++ b/Midterm_Exam_Key.docx
@@ -3265,79 +3265,61 @@
           <w:sz w:val="22"/>
           <w:szCs w:val="22"/>
         </w:rPr>
-        <w:t xml:space="preserve">26. Pidgin Hawaiian, 1892</w:t>
-      </w:r>
-    </w:p>
-    <w:p>
-      <w:pPr>
-        <w:pStyle w:val="ListParagraph"/>
-        <w:numPr>
-          <w:ilvl w:val="0"/>
-          <w:numId w:val="2"/>
-        </w:numPr>
-        <w:spacing w:after="60"/>
-      </w:pPr>
-      <w:r>
-        <w:rPr>
-          <w:rFonts w:ascii="Calibri" w:cs="Calibri" w:eastAsia="Calibri" w:hAnsi="Calibri"/>
-          <w:sz w:val="22"/>
-          <w:szCs w:val="22"/>
-        </w:rPr>
-        <w:t xml:space="preserve">(a) "Your horse went and ate my bran last night" (2; accept close)</w:t>
-      </w:r>
-    </w:p>
-    <w:p>
-      <w:pPr>
-        <w:pStyle w:val="ListParagraph"/>
-        <w:numPr>
-          <w:ilvl w:val="0"/>
-          <w:numId w:val="2"/>
-        </w:numPr>
-        <w:spacing w:after="60"/>
-      </w:pPr>
-      <w:r>
-        <w:rPr>
-          <w:rFonts w:ascii="Calibri" w:cs="Calibri" w:eastAsia="Calibri" w:hAnsi="Calibri"/>
-          <w:sz w:val="22"/>
-          <w:szCs w:val="22"/>
-        </w:rPr>
-        <w:t xml:space="preserve">(b) Hawaiian (1)</w:t>
-      </w:r>
-    </w:p>
-    <w:p>
-      <w:pPr>
-        <w:pStyle w:val="ListParagraph"/>
-        <w:numPr>
-          <w:ilvl w:val="0"/>
-          <w:numId w:val="2"/>
-        </w:numPr>
-        <w:spacing w:after="60"/>
-      </w:pPr>
-      <w:r>
-        <w:rPr>
-          <w:rFonts w:ascii="Calibri" w:cs="Calibri" w:eastAsia="Calibri" w:hAnsi="Calibri"/>
-          <w:sz w:val="22"/>
-          <w:szCs w:val="22"/>
-        </w:rPr>
-        <w:t xml:space="preserve">(c) The possessor follows the thing possessed (lio oe, palani wau) while Hawaiian places the possessive first (kou lio, kaʻu palani); no ua marker for past; no standard Hawaiian grammar words (2)</w:t>
-      </w:r>
-    </w:p>
-    <w:p>
-      <w:pPr>
-        <w:pStyle w:val="ListParagraph"/>
-        <w:numPr>
-          <w:ilvl w:val="0"/>
-          <w:numId w:val="2"/>
-        </w:numPr>
-        <w:spacing w:after="60"/>
-      </w:pPr>
-      <w:r>
-        <w:rPr>
-          <w:rFonts w:ascii="Calibri" w:cs="Calibri" w:eastAsia="Calibri" w:hAnsi="Calibri"/>
-          <w:sz w:val="22"/>
-          <w:szCs w:val="22"/>
-        </w:rPr>
-        <w:t xml:space="preserve">(d) Pidgin: second-language speakers, restricted/informal use, variable form, immigrants rather than children; creole emerged later (about 1905-1920) with locally born children (3)</w:t>
+        <w:t xml:space="preserve">26. From pidgin to creole in Hawaiʻi</w:t>
+      </w:r>
+    </w:p>
+    <w:p>
+      <w:pPr>
+        <w:pStyle w:val="ListParagraph"/>
+        <w:numPr>
+          <w:ilvl w:val="0"/>
+          <w:numId w:val="2"/>
+        </w:numPr>
+        <w:spacing w:after="60"/>
+      </w:pPr>
+      <w:r>
+        <w:rPr>
+          <w:rFonts w:ascii="Calibri" w:cs="Calibri" w:eastAsia="Calibri" w:hAnsi="Calibri"/>
+          <w:sz w:val="22"/>
+          <w:szCs w:val="22"/>
+        </w:rPr>
+        <w:t xml:space="preserve">(a) Hawaiian; Hawaiians still ruled in 1835 and Hawaiian was the language of government and of schooling for non-European children, so it was the language used to run the plantations (2)</w:t>
+      </w:r>
+    </w:p>
+    <w:p>
+      <w:pPr>
+        <w:pStyle w:val="ListParagraph"/>
+        <w:numPr>
+          <w:ilvl w:val="0"/>
+          <w:numId w:val="2"/>
+        </w:numPr>
+        <w:spacing w:after="60"/>
+      </w:pPr>
+      <w:r>
+        <w:rPr>
+          <w:rFonts w:ascii="Calibri" w:cs="Calibri" w:eastAsia="Calibri" w:hAnsi="Calibri"/>
+          <w:sz w:val="22"/>
+          <w:szCs w:val="22"/>
+        </w:rPr>
+        <w:t xml:space="preserve">(b) Locally born children acquiring Pidgin from birth (about 1900 onward; locally born children equal or outnumber foreign born by 1920-30). A creole has native speakers and a full range of functions; a pidgin is a second language used in limited situations (3)</w:t>
+      </w:r>
+    </w:p>
+    <w:p>
+      <w:pPr>
+        <w:pStyle w:val="ListParagraph"/>
+        <w:numPr>
+          <w:ilvl w:val="0"/>
+          <w:numId w:val="2"/>
+        </w:numPr>
+        <w:spacing w:after="60"/>
+      </w:pPr>
+      <w:r>
+        <w:rPr>
+          <w:rFonts w:ascii="Calibri" w:cs="Calibri" w:eastAsia="Calibri" w:hAnsi="Calibri"/>
+          <w:sz w:val="22"/>
+          <w:szCs w:val="22"/>
+        </w:rPr>
+        <w:t xml:space="preserve">(c) Any two-sentence answer showing change over time: Hawaiian-based pidgin first, then English-based pidgin, then a creole spoken as a first language with its own grammar (for example never, stay, for); it is a language in its own right, not English with errors (3)</w:t>
       </w:r>
     </w:p>
     <w:p>
@@ -3750,7 +3732,7 @@
           <w:sz w:val="22"/>
           <w:szCs w:val="22"/>
         </w:rPr>
-        <w:t xml:space="preserve">Pidgin Hawaiian example (Part C3) and the Polynesian sound correspondences (Part C1) were adapted from lecture slides; confirm the Hawaiian-Māori-Samoan-Tongan forms before printing.</w:t>
+        <w:t xml:space="preserve">The Hawaiʻi timeline (Part C3) is adapted from the Oct 15 slides (Sakoda &amp; Siegel); the Polynesian sound correspondences (Part C1) were adapted from lecture slides, so confirm the Hawaiian-Māori-Samoan-Tongan forms before printing.</w:t>
       </w:r>
     </w:p>
     <w:sectPr>

</xml_diff>

<commit_message>
add link to hawaiian literacy slides
</commit_message>
<xml_diff>
--- a/Midterm_Exam_Key.docx
+++ b/Midterm_Exam_Key.docx
@@ -1788,7 +1788,7 @@
                 <w:sz w:val="20"/>
                 <w:szCs w:val="20"/>
               </w:rPr>
-              <w:t xml:space="preserve">8</w:t>
+              <w:t xml:space="preserve">2</w:t>
             </w:r>
           </w:p>
         </w:tc>
@@ -1820,7 +1820,7 @@
                 <w:sz w:val="20"/>
                 <w:szCs w:val="20"/>
               </w:rPr>
-              <w:t xml:space="preserve">MC</w:t>
+              <w:t xml:space="preserve">FIB</w:t>
             </w:r>
           </w:p>
         </w:tc>
@@ -1852,7 +1852,7 @@
                 <w:sz w:val="20"/>
                 <w:szCs w:val="20"/>
               </w:rPr>
-              <w:t xml:space="preserve">B</w:t>
+              <w:t xml:space="preserve">subgroup (accept "branch")</w:t>
             </w:r>
           </w:p>
         </w:tc>
@@ -1884,7 +1884,7 @@
                 <w:sz w:val="20"/>
                 <w:szCs w:val="20"/>
               </w:rPr>
-              <w:t xml:space="preserve">Meyerhoff, pp. 144-145.</w:t>
+              <w:t xml:space="preserve">Blust (Ch. 2); Lynch (Ch. 1): Oceanic is a subgroup (branch) of Austronesian.</w:t>
             </w:r>
           </w:p>
         </w:tc>
@@ -2552,7 +2552,7 @@
           <w:sz w:val="22"/>
           <w:szCs w:val="22"/>
         </w:rPr>
-        <w:t xml:space="preserve">Why do "culture areas" (Micronesia, Polynesia, Melanesia) not line up neatly with language families? Give one Micronesian example.</w:t>
+        <w:t xml:space="preserve">Why do "culture areas" (Micronesia, Polynesia, Melanesia) not line up neatly with language families? Give one example.</w:t>
       </w:r>
     </w:p>
     <w:p>
@@ -2630,61 +2630,61 @@
           <w:sz w:val="22"/>
           <w:szCs w:val="22"/>
         </w:rPr>
-        <w:t xml:space="preserve">Before Pawley (1966), scholars grouped Polynesian languages into western vs. eastern. What did Pawley's grammatical evidence show, and what does this teach us about using geography?</w:t>
-      </w:r>
-    </w:p>
-    <w:p>
-      <w:pPr>
-        <w:pStyle w:val="ListParagraph"/>
-        <w:numPr>
-          <w:ilvl w:val="0"/>
-          <w:numId w:val="2"/>
-        </w:numPr>
-        <w:spacing w:after="60"/>
-      </w:pPr>
-      <w:r>
-        <w:rPr>
-          <w:rFonts w:ascii="Calibri" w:cs="Calibri" w:eastAsia="Calibri" w:hAnsi="Calibri"/>
-          <w:sz w:val="22"/>
-          <w:szCs w:val="22"/>
-        </w:rPr>
-        <w:t xml:space="preserve">Tongan/Niuean form a separate branch; Samoan belongs with the Samoic-Outlier group (2)</w:t>
-      </w:r>
-    </w:p>
-    <w:p>
-      <w:pPr>
-        <w:pStyle w:val="ListParagraph"/>
-        <w:numPr>
-          <w:ilvl w:val="0"/>
-          <w:numId w:val="2"/>
-        </w:numPr>
-        <w:spacing w:after="60"/>
-      </w:pPr>
-      <w:r>
-        <w:rPr>
-          <w:rFonts w:ascii="Calibri" w:cs="Calibri" w:eastAsia="Calibri" w:hAnsi="Calibri"/>
-          <w:sz w:val="22"/>
-          <w:szCs w:val="22"/>
-        </w:rPr>
-        <w:t xml:space="preserve">Hawaiian belongs to East Polynesian (with Rapanui as a separate branch) (1)</w:t>
-      </w:r>
-    </w:p>
-    <w:p>
-      <w:pPr>
-        <w:pStyle w:val="ListParagraph"/>
-        <w:numPr>
-          <w:ilvl w:val="0"/>
-          <w:numId w:val="2"/>
-        </w:numPr>
-        <w:spacing w:after="60"/>
-      </w:pPr>
-      <w:r>
-        <w:rPr>
-          <w:rFonts w:ascii="Calibri" w:cs="Calibri" w:eastAsia="Calibri" w:hAnsi="Calibri"/>
-          <w:sz w:val="22"/>
-          <w:szCs w:val="22"/>
-        </w:rPr>
-        <w:t xml:space="preserve">Shared innovations override geography (1)</w:t>
+        <w:t xml:space="preserve">Two Polynesian languages can share many cognates and still not be mutually intelligible. Explain the difference between these two ideas and give one reason this can happen.</w:t>
+      </w:r>
+    </w:p>
+    <w:p>
+      <w:pPr>
+        <w:pStyle w:val="ListParagraph"/>
+        <w:numPr>
+          <w:ilvl w:val="0"/>
+          <w:numId w:val="2"/>
+        </w:numPr>
+        <w:spacing w:after="60"/>
+      </w:pPr>
+      <w:r>
+        <w:rPr>
+          <w:rFonts w:ascii="Calibri" w:cs="Calibri" w:eastAsia="Calibri" w:hAnsi="Calibri"/>
+          <w:sz w:val="22"/>
+          <w:szCs w:val="22"/>
+        </w:rPr>
+        <w:t xml:space="preserve">Cognates = words inherited from a common ancestor (1); mutual intelligibility = whether speakers can actually understand each other (1)</w:t>
+      </w:r>
+    </w:p>
+    <w:p>
+      <w:pPr>
+        <w:pStyle w:val="ListParagraph"/>
+        <w:numPr>
+          <w:ilvl w:val="0"/>
+          <w:numId w:val="2"/>
+        </w:numPr>
+        <w:spacing w:after="60"/>
+      </w:pPr>
+      <w:r>
+        <w:rPr>
+          <w:rFonts w:ascii="Calibri" w:cs="Calibri" w:eastAsia="Calibri" w:hAnsi="Calibri"/>
+          <w:sz w:val="22"/>
+          <w:szCs w:val="22"/>
+        </w:rPr>
+        <w:t xml:space="preserve">One valid reason: sound changes, differences in grammar or vocabulary, borrowing, time apart, or contact with other languages (2)</w:t>
+      </w:r>
+    </w:p>
+    <w:p>
+      <w:pPr>
+        <w:pStyle w:val="ListParagraph"/>
+        <w:numPr>
+          <w:ilvl w:val="0"/>
+          <w:numId w:val="2"/>
+        </w:numPr>
+        <w:spacing w:after="60"/>
+      </w:pPr>
+      <w:r>
+        <w:rPr>
+          <w:rFonts w:ascii="Calibri" w:cs="Calibri" w:eastAsia="Calibri" w:hAnsi="Calibri"/>
+          <w:sz w:val="22"/>
+          <w:szCs w:val="22"/>
+        </w:rPr>
+        <w:t xml:space="preserve">Full credit needs the two ideas kept distinct and one specific reason, not just "they sound different" (no extra points)</w:t>
       </w:r>
     </w:p>
     <w:p>
@@ -3020,61 +3020,61 @@
           <w:sz w:val="22"/>
           <w:szCs w:val="22"/>
         </w:rPr>
-        <w:t xml:space="preserve">Jourdan &amp; Angeli describe four language ideologies in Honiara. Name two and explain how they conflict in how Solomon Islanders view Pijin or local languages.</w:t>
-      </w:r>
-    </w:p>
-    <w:p>
-      <w:pPr>
-        <w:pStyle w:val="ListParagraph"/>
-        <w:numPr>
-          <w:ilvl w:val="0"/>
-          <w:numId w:val="2"/>
-        </w:numPr>
-        <w:spacing w:after="60"/>
-      </w:pPr>
-      <w:r>
-        <w:rPr>
-          <w:rFonts w:ascii="Calibri" w:cs="Calibri" w:eastAsia="Calibri" w:hAnsi="Calibri"/>
-          <w:sz w:val="22"/>
-          <w:szCs w:val="22"/>
-        </w:rPr>
-        <w:t xml:space="preserve">Two named: reciprocal multilingualism, hierarchical multilingualism, linguistic pragmatism, linguistic nationalism (1)</w:t>
-      </w:r>
-    </w:p>
-    <w:p>
-      <w:pPr>
-        <w:pStyle w:val="ListParagraph"/>
-        <w:numPr>
-          <w:ilvl w:val="0"/>
-          <w:numId w:val="2"/>
-        </w:numPr>
-        <w:spacing w:after="60"/>
-      </w:pPr>
-      <w:r>
-        <w:rPr>
-          <w:rFonts w:ascii="Calibri" w:cs="Calibri" w:eastAsia="Calibri" w:hAnsi="Calibri"/>
-          <w:sz w:val="22"/>
-          <w:szCs w:val="22"/>
-        </w:rPr>
-        <w:t xml:space="preserve">Accurate description of each (1 each; 2 total)</w:t>
-      </w:r>
-    </w:p>
-    <w:p>
-      <w:pPr>
-        <w:pStyle w:val="ListParagraph"/>
-        <w:numPr>
-          <w:ilvl w:val="0"/>
-          <w:numId w:val="2"/>
-        </w:numPr>
-        <w:spacing w:after="60"/>
-      </w:pPr>
-      <w:r>
-        <w:rPr>
-          <w:rFonts w:ascii="Calibri" w:cs="Calibri" w:eastAsia="Calibri" w:hAnsi="Calibri"/>
-          <w:sz w:val="22"/>
-          <w:szCs w:val="22"/>
-        </w:rPr>
-        <w:t xml:space="preserve">Conflict: e.g., hierarchical ideology calls Pijin "broken English" vs. nationalism wants local languages valued (1)</w:t>
+        <w:t xml:space="preserve">People in Hawaiʻi hold very different attitudes toward Pidgin. Describe two contrasting attitudes and give one reason each exists.</w:t>
+      </w:r>
+    </w:p>
+    <w:p>
+      <w:pPr>
+        <w:pStyle w:val="ListParagraph"/>
+        <w:numPr>
+          <w:ilvl w:val="0"/>
+          <w:numId w:val="2"/>
+        </w:numPr>
+        <w:spacing w:after="60"/>
+      </w:pPr>
+      <w:r>
+        <w:rPr>
+          <w:rFonts w:ascii="Calibri" w:cs="Calibri" w:eastAsia="Calibri" w:hAnsi="Calibri"/>
+          <w:sz w:val="22"/>
+          <w:szCs w:val="22"/>
+        </w:rPr>
+        <w:t xml:space="preserve">Two contrasting attitudes named, e.g., Pidgin as "broken"/"bad English" or unsuitable for school and work, vs. Pidgin as a marker of local identity and community pride (2)</w:t>
+      </w:r>
+    </w:p>
+    <w:p>
+      <w:pPr>
+        <w:pStyle w:val="ListParagraph"/>
+        <w:numPr>
+          <w:ilvl w:val="0"/>
+          <w:numId w:val="2"/>
+        </w:numPr>
+        <w:spacing w:after="60"/>
+      </w:pPr>
+      <w:r>
+        <w:rPr>
+          <w:rFonts w:ascii="Calibri" w:cs="Calibri" w:eastAsia="Calibri" w:hAnsi="Calibri"/>
+          <w:sz w:val="22"/>
+          <w:szCs w:val="22"/>
+        </w:rPr>
+        <w:t xml:space="preserve">One reason for each (1 each; 2 total), e.g., standard-English school policy and the 1987 Board of Education decision; plantation history and local identity; Da Pidgin Coup</w:t>
+      </w:r>
+    </w:p>
+    <w:p>
+      <w:pPr>
+        <w:pStyle w:val="ListParagraph"/>
+        <w:numPr>
+          <w:ilvl w:val="0"/>
+          <w:numId w:val="2"/>
+        </w:numPr>
+        <w:spacing w:after="60"/>
+      </w:pPr>
+      <w:r>
+        <w:rPr>
+          <w:rFonts w:ascii="Calibri" w:cs="Calibri" w:eastAsia="Calibri" w:hAnsi="Calibri"/>
+          <w:sz w:val="22"/>
+          <w:szCs w:val="22"/>
+        </w:rPr>
+        <w:t xml:space="preserve">Zero credit for naming attitudes only, with no reason; accept any reasonable attitudes drawn from lecture or readings (no extra points)</w:t>
       </w:r>
     </w:p>
     <w:p>
@@ -3195,43 +3195,43 @@
           <w:sz w:val="22"/>
           <w:szCs w:val="22"/>
         </w:rPr>
-        <w:t xml:space="preserve">25. Reading Bislama</w:t>
-      </w:r>
-    </w:p>
-    <w:p>
-      <w:pPr>
-        <w:pStyle w:val="ListParagraph"/>
-        <w:numPr>
-          <w:ilvl w:val="0"/>
-          <w:numId w:val="2"/>
-        </w:numPr>
-        <w:spacing w:after="60"/>
-      </w:pPr>
-      <w:r>
-        <w:rPr>
-          <w:rFonts w:ascii="Calibri" w:cs="Calibri" w:eastAsia="Calibri" w:hAnsi="Calibri"/>
-          <w:sz w:val="22"/>
-          <w:szCs w:val="22"/>
-        </w:rPr>
-        <w:t xml:space="preserve">(a) Any three: atikol (article), ripot (report), stadi (study), edukesen, polisi, skul, selected, venakula (vernacular), put, together (2)</w:t>
-      </w:r>
-    </w:p>
-    <w:p>
-      <w:pPr>
-        <w:pStyle w:val="ListParagraph"/>
-        <w:numPr>
-          <w:ilvl w:val="0"/>
-          <w:numId w:val="2"/>
-        </w:numPr>
-        <w:spacing w:after="60"/>
-      </w:pPr>
-      <w:r>
-        <w:rPr>
-          <w:rFonts w:ascii="Calibri" w:cs="Calibri" w:eastAsia="Calibri" w:hAnsi="Calibri"/>
-          <w:sz w:val="22"/>
-          <w:szCs w:val="22"/>
-        </w:rPr>
-        <w:t xml:space="preserve">(b) Any two: i marker before the verb; reduplication (lukluk); -um on transitive verbs (putum); blong for possession; long as general preposition; ol as plural marker (1.5 each)</w:t>
+        <w:t xml:space="preserve">25. Bislama data</w:t>
+      </w:r>
+    </w:p>
+    <w:p>
+      <w:pPr>
+        <w:pStyle w:val="ListParagraph"/>
+        <w:numPr>
+          <w:ilvl w:val="0"/>
+          <w:numId w:val="2"/>
+        </w:numPr>
+        <w:spacing w:after="60"/>
+      </w:pPr>
+      <w:r>
+        <w:rPr>
+          <w:rFonts w:ascii="Calibri" w:cs="Calibri" w:eastAsia="Calibri" w:hAnsi="Calibri"/>
+          <w:sz w:val="22"/>
+          <w:szCs w:val="22"/>
+        </w:rPr>
+        <w:t xml:space="preserve">(a) -em is added to the verb when it has an object (it is transitive) (1); English uses the same verb with or without an object, so it does not do this (1)</w:t>
+      </w:r>
+    </w:p>
+    <w:p>
+      <w:pPr>
+        <w:pStyle w:val="ListParagraph"/>
+        <w:numPr>
+          <w:ilvl w:val="0"/>
+          <w:numId w:val="2"/>
+        </w:numPr>
+        <w:spacing w:after="60"/>
+      </w:pPr>
+      <w:r>
+        <w:rPr>
+          <w:rFonts w:ascii="Calibri" w:cs="Calibri" w:eastAsia="Calibri" w:hAnsi="Calibri"/>
+          <w:sz w:val="22"/>
+          <w:szCs w:val="22"/>
+        </w:rPr>
+        <w:t xml:space="preserve">(b) Repetition (reduplication) adds the sense of "a lot," "many," or intensity (1); English doesn't normally mark this by repeating the verb (1); reduplication is common in Pacific languages, including the Oceanic languages of Vanuatu, so it points to the substrate, not English (1)</w:t>
       </w:r>
     </w:p>
     <w:p>
@@ -3265,61 +3265,61 @@
           <w:sz w:val="22"/>
           <w:szCs w:val="22"/>
         </w:rPr>
-        <w:t xml:space="preserve">26. From pidgin to creole in Hawaiʻi</w:t>
-      </w:r>
-    </w:p>
-    <w:p>
-      <w:pPr>
-        <w:pStyle w:val="ListParagraph"/>
-        <w:numPr>
-          <w:ilvl w:val="0"/>
-          <w:numId w:val="2"/>
-        </w:numPr>
-        <w:spacing w:after="60"/>
-      </w:pPr>
-      <w:r>
-        <w:rPr>
-          <w:rFonts w:ascii="Calibri" w:cs="Calibri" w:eastAsia="Calibri" w:hAnsi="Calibri"/>
-          <w:sz w:val="22"/>
-          <w:szCs w:val="22"/>
-        </w:rPr>
-        <w:t xml:space="preserve">(a) Hawaiian; Hawaiians still ruled in 1835 and Hawaiian was the language of government and of schooling for non-European children, so it was the language used to run the plantations (2)</w:t>
-      </w:r>
-    </w:p>
-    <w:p>
-      <w:pPr>
-        <w:pStyle w:val="ListParagraph"/>
-        <w:numPr>
-          <w:ilvl w:val="0"/>
-          <w:numId w:val="2"/>
-        </w:numPr>
-        <w:spacing w:after="60"/>
-      </w:pPr>
-      <w:r>
-        <w:rPr>
-          <w:rFonts w:ascii="Calibri" w:cs="Calibri" w:eastAsia="Calibri" w:hAnsi="Calibri"/>
-          <w:sz w:val="22"/>
-          <w:szCs w:val="22"/>
-        </w:rPr>
-        <w:t xml:space="preserve">(b) Locally born children acquiring Pidgin from birth (about 1900 onward; locally born children equal or outnumber foreign born by 1920-30). A creole has native speakers and a full range of functions; a pidgin is a second language used in limited situations (3)</w:t>
-      </w:r>
-    </w:p>
-    <w:p>
-      <w:pPr>
-        <w:pStyle w:val="ListParagraph"/>
-        <w:numPr>
-          <w:ilvl w:val="0"/>
-          <w:numId w:val="2"/>
-        </w:numPr>
-        <w:spacing w:after="60"/>
-      </w:pPr>
-      <w:r>
-        <w:rPr>
-          <w:rFonts w:ascii="Calibri" w:cs="Calibri" w:eastAsia="Calibri" w:hAnsi="Calibri"/>
-          <w:sz w:val="22"/>
-          <w:szCs w:val="22"/>
-        </w:rPr>
-        <w:t xml:space="preserve">(c) Any two-sentence answer showing change over time: Hawaiian-based pidgin first, then English-based pidgin, then a creole spoken as a first language with its own grammar (for example never, stay, for); it is a language in its own right, not English with errors (3)</w:t>
+        <w:t xml:space="preserve">26. Working out a family tree</w:t>
+      </w:r>
+    </w:p>
+    <w:p>
+      <w:pPr>
+        <w:pStyle w:val="ListParagraph"/>
+        <w:numPr>
+          <w:ilvl w:val="0"/>
+          <w:numId w:val="2"/>
+        </w:numPr>
+        <w:spacing w:after="60"/>
+      </w:pPr>
+      <w:r>
+        <w:rPr>
+          <w:rFonts w:ascii="Calibri" w:cs="Calibri" w:eastAsia="Calibri" w:hAnsi="Calibri"/>
+          <w:sz w:val="22"/>
+          <w:szCs w:val="22"/>
+        </w:rPr>
+        <w:t xml:space="preserve">(a) B, C, and D form a subgroup: they share b → v (bako → vako) (1). C and D also share s → h and g → k (sime → hime, gito → kito), so C and D are most closely related and B split off earlier (2)</w:t>
+      </w:r>
+    </w:p>
+    <w:p>
+      <w:pPr>
+        <w:pStyle w:val="ListParagraph"/>
+        <w:numPr>
+          <w:ilvl w:val="0"/>
+          <w:numId w:val="2"/>
+        </w:numPr>
+        <w:spacing w:after="60"/>
+      </w:pPr>
+      <w:r>
+        <w:rPr>
+          <w:rFonts w:ascii="Calibri" w:cs="Calibri" w:eastAsia="Calibri" w:hAnsi="Calibri"/>
+          <w:sz w:val="22"/>
+          <w:szCs w:val="22"/>
+        </w:rPr>
+        <w:t xml:space="preserve">(b) No. Keeping old features is a shared retention, which does not show a special relationship, because any language can simply keep them (2). Only shared innovations (changes) are evidence for a subgroup, and A and E share none (1)</w:t>
+      </w:r>
+    </w:p>
+    <w:p>
+      <w:pPr>
+        <w:pStyle w:val="ListParagraph"/>
+        <w:numPr>
+          <w:ilvl w:val="0"/>
+          <w:numId w:val="2"/>
+        </w:numPr>
+        <w:spacing w:after="60"/>
+      </w:pPr>
+      <w:r>
+        <w:rPr>
+          <w:rFonts w:ascii="Calibri" w:cs="Calibri" w:eastAsia="Calibri" w:hAnsi="Calibri"/>
+          <w:sz w:val="22"/>
+          <w:szCs w:val="22"/>
+        </w:rPr>
+        <w:t xml:space="preserve">(c) vaki (1); C changed b → v and g → k (1). The implied tree is A, E, and then (B (C, D))</w:t>
       </w:r>
     </w:p>
     <w:p>
@@ -3474,7 +3474,7 @@
           <w:sz w:val="22"/>
           <w:szCs w:val="22"/>
         </w:rPr>
-        <w:t xml:space="preserve">"Pidgin is just broken English." Respond to this claim using evidence from at least two of: Meyerhoff (Ch. 13), Jourdan &amp; Angeli (Honiara), and Sakoda &amp; Siegel (Hawaiʻi). Explain what the claim gets wrong, why people believe it, and what is at stake for speakers.</w:t>
+        <w:t xml:space="preserve">"Pidgin is just broken English." Respond to this claim using evidence from: Meyerhoff (Ch. 13) and Sakoda &amp; Siegel (Hawaiʻi). Explain what the claim gets wrong, why people believe it, and what is at stake for speakers.</w:t>
       </w:r>
     </w:p>
     <w:p>
@@ -3528,7 +3528,7 @@
           <w:sz w:val="22"/>
           <w:szCs w:val="22"/>
         </w:rPr>
-        <w:t xml:space="preserve">Social explanation: ideologies, colonial hierarchy, standard-English policy (5)</w:t>
+        <w:t xml:space="preserve">Social explanation: attitudes, colonial hierarchy, standard-English policy (5)</w:t>
       </w:r>
     </w:p>
     <w:p>
@@ -3732,7 +3732,7 @@
           <w:sz w:val="22"/>
           <w:szCs w:val="22"/>
         </w:rPr>
-        <w:t xml:space="preserve">The Hawaiʻi timeline (Part C3) is adapted from the Oct 15 slides (Sakoda &amp; Siegel); the Polynesian sound correspondences (Part C1) were adapted from lecture slides, so confirm the Hawaiian-Māori-Samoan-Tongan forms before printing.</w:t>
+        <w:t xml:space="preserve">The Bislama data (Part C2) is from the substrate slide (Meyerhoff, pp. 146-147); check the "cut.cut" gloss. The family-tree languages (Part C3) are invented. The Polynesian sound correspondences (Part C1) were adapted from lecture slides, so confirm the Hawaiian-Māori-Samoan-Tongan forms before printing.</w:t>
       </w:r>
     </w:p>
     <w:sectPr>

</xml_diff>